<commit_message>
Add double-halo measurement diagram to the diameter SOP
Reading the inner ring instead of the outer rim is the error most likely to be
made and least likely to be noticed, and it biases in one direction: it
underestimates by roughly 3-5 mm, enough to record a 20 mm cell as 16 mm and
move it across the stratification line. Prose alone does not prevent it, so the
measurement step now carries a figure showing the caliper spanning the outer
rim, the same battery measured wrongly at the inner ring with the resulting
error stated, and a plain coin alongside for the battery-versus-coin check the
preceding step asks for.

The check and cross marks are drawn as vector paths rather than set as ✓ and ✗
glyphs, which the CJK font renders as tofu boxes.

docs/halo.svg is the source; docs/halo.png is what make_sop.js embeds.

Co-Authored-By: Claude Opus 5 <noreply@anthropic.com>
Claude-Session: https://claude.ai/code/session_01P7GsnHCvhhuvFRQxZnwrw1
</commit_message>
<xml_diff>
--- a/docs/纽扣电池直径测量SOP.docx
+++ b/docs/纽扣电池直径测量SOP.docx
@@ -1595,7 +1595,7 @@
           <w:sz w:val="21"/>
           <w:szCs w:val="21"/>
         </w:rPr>
-        <w:t xml:space="preserve">量外环。双环征的外环是电池卷边外缘，那才是标称直径；内环偏小，量错会系统性低估。</w:t>
+        <w:t xml:space="preserve">量外环（见下图）。双环征的外环是电池卷边外缘，那才是标称直径；内环偏小，量错会系统性低估。</w:t>
       </w:r>
     </w:p>
     <w:p>
@@ -1634,6 +1634,67 @@
           <w:szCs w:val="21"/>
         </w:rPr>
         <w:t xml:space="preserve">若为多枚电池，逐枚测量并编号（#1、#2…），分别记录。</w:t>
+      </w:r>
+    </w:p>
+    <w:p>
+      <w:pPr>
+        <w:spacing w:after="60" w:before="200"/>
+        <w:jc w:val="center"/>
+      </w:pPr>
+      <w:r>
+        <w:drawing>
+          <wp:inline distT="0" distB="0" distL="0" distR="0">
+            <wp:extent cx="5524500" cy="2390775"/>
+            <wp:effectExtent t="0" r="0" b="0" l="0"/>
+            <wp:docPr id="1" name="" descr="" title=""/>
+            <wp:cNvGraphicFramePr>
+              <a:graphicFrameLocks xmlns:a="http://schemas.openxmlformats.org/drawingml/2006/main" noChangeAspect="1"/>
+            </wp:cNvGraphicFramePr>
+            <a:graphic xmlns:a="http://schemas.openxmlformats.org/drawingml/2006/main">
+              <a:graphicData uri="http://schemas.openxmlformats.org/drawingml/2006/picture">
+                <pic:pic xmlns:pic="http://schemas.openxmlformats.org/drawingml/2006/picture">
+                  <pic:nvPicPr>
+                    <pic:cNvPr id="0" name="" descr=""/>
+                    <pic:cNvPicPr>
+                      <a:picLocks noChangeAspect="1" noChangeArrowheads="1"/>
+                    </pic:cNvPicPr>
+                  </pic:nvPicPr>
+                  <pic:blipFill>
+                    <a:blip r:embed="rId9" cstate="none"/>
+                    <a:srcRect/>
+                    <a:stretch>
+                      <a:fillRect/>
+                    </a:stretch>
+                  </pic:blipFill>
+                  <pic:spPr bwMode="auto">
+                    <a:xfrm>
+                      <a:off x="0" y="0"/>
+                      <a:ext cx="5524500" cy="2390775"/>
+                    </a:xfrm>
+                    <a:prstGeom prst="rect">
+                      <a:avLst/>
+                    </a:prstGeom>
+                  </pic:spPr>
+                </pic:pic>
+              </a:graphicData>
+            </a:graphic>
+          </wp:inline>
+        </w:drawing>
+      </w:r>
+    </w:p>
+    <w:p>
+      <w:pPr>
+        <w:spacing w:after="220"/>
+        <w:jc w:val="center"/>
+      </w:pPr>
+      <w:r>
+        <w:rPr>
+          <w:rFonts w:ascii="Microsoft YaHei" w:cs="Microsoft YaHei" w:eastAsia="Microsoft YaHei" w:hAnsi="Microsoft YaHei"/>
+          <w:color w:val="4E5961"/>
+          <w:sz w:val="18"/>
+          <w:szCs w:val="18"/>
+        </w:rPr>
+        <w:t xml:space="preserve">图 1　双环征的测量位置。卡尺应跨越外环全径；量内环会系统性低估约 3–5 mm，足以把一枚 20 mm 电池误判为 16 mm——恰好跨过分层线。</w:t>
       </w:r>
     </w:p>
     <w:p>

</xml_diff>